<commit_message>
Close OI-09: lock EEG cable routing path in shell CAD model (RISK-21, G2-11)
NP-DRV-SHELL-001 Rev B: adds §2.4.5 with locked EEG cable routing path
specification. Main trunk (8×5mm, ~120mm occipital arc) bifurcates at crown
junction into left (C3/F3/Fp1/P3) and right (C4/F4/Fp2/P4) lateral branches
(6×4mm, 80–200mm arc each), all on outer CFRP inner surface opposite the FPC
bundle. Shell wall routing achieves 18–22mm FPC-to-EEG separation — DRC-18
PASSES without barrier. Channel spec handed to shell tooling supplier.

- OI-09 CLOSED (EEG routing diagram produced, path locked)
- OI-10 CLOSED (18–22mm clearance confirmed, DRC-18b barrier not required)
- DRC-22 CLOSED (8×5mm channel present in shell CAD)
- DRC-23 CLOSED (DRC-18 verified ≥15mm)
- G2-11 CLOSED in NP-COORD-001 Rev A.2
- CLAUDE.md §13.4 pending item marked complete; §13.5 locked decision updated

Resolves GitHub Issue #14.

https://claude.ai/code/session_011XfvK4Nqrn3FfuK6aq69DV
</commit_message>
<xml_diff>
--- a/docs/neuropulse_eng_coordination_checklist.docx
+++ b/docs/neuropulse_eng_coordination_checklist.docx
@@ -3976,7 +3976,7 @@
               <w:rPr>
                 <w:sz w:val="16"/>
               </w:rPr>
-              <w:t xml:space="preserve">OPEN — §2.4 in progress (RISK-21)</w:t>
+              <w:t>CLOSED — NP-DRV-SHELL-001 Rev B §2.4.5 (2026-05-10). EEG cable routing path locked; OI-09 closed; DRC-22 and DRC-23 CLOSED. 8×5mm main trunk + 6×4mm branch channels specified in shell CAD; spec handed to tooling supplier. DRC-18 verified (18–22mm separation).</w:t>
             </w:r>
           </w:p>
         </w:tc>
@@ -7052,7 +7052,7 @@
               <w:rPr>
                 <w:sz w:val="16"/>
               </w:rPr>
-              <w:t xml:space="preserve">OPEN — §2.4 in progress (RISK-21)</w:t>
+              <w:t>CLOSED — NP-DRV-SHELL-001 Rev B §2.4.5 (2026-05-10). EEG cable routing path locked; OI-09 closed; DRC-22 and DRC-23 CLOSED. 8×5mm main trunk + 6×4mm branch channels specified in shell CAD; spec handed to tooling supplier. DRC-18 verified (18–22mm separation).</w:t>
             </w:r>
           </w:p>
         </w:tc>
@@ -7734,7 +7734,7 @@
         <w:spacing w:after="160"/>
       </w:pPr>
       <w:r>
-        <w:t>Status at 2026-05-10: 2 BLOCKING items (G1-01 regulatory opinion, G1-07 LED part numbers). G1-13 CLOSED (NP-FW-REQ-001 Rev A). G1-15 CLOSED (FPC layout freeze). All other items OPEN. Gate G1 cannot be declared open until BLOCKING items are resolved. No layout, tooling, or production work may begin until BLOCKING items are closed.</w:t>
+        <w:t>Status at 2026-05-10: 2 BLOCKING items (G1-01 regulatory opinion, G1-07 LED part numbers). G1-13 CLOSED (NP-FW-REQ-001 Rev A). G1-15 CLOSED (FPC layout freeze). G2-11 CLOSED (NP-DRV-SHELL-001 Rev B, EEG cable routing locked). All other items OPEN. Gate G1 cannot be declared open until BLOCKING items are resolved. No layout, tooling, or production work may begin until BLOCKING items are closed.</w:t>
       </w:r>
     </w:p>
     <w:p>
@@ -7888,6 +7888,71 @@
                 <w:sz w:val="16"/>
               </w:rPr>
               <w:t>Initial release. RISK-13 (primary) — LED PWM carrier frequency / EEG coordination. Consolidates all cross-discipline coordination items from RISK-01 through RISK-17 and OI-01 through OI-13 into 3-gate structure. 27 coordination items total. | Rev A.1 update: G2-02 extended with blind-user accessibility requirements (RISK-15): tactile dots, braille, raised numeral. G2-10 added: audio zone ID firmware.</w:t>
+            </w:r>
+          </w:p>
+        </w:tc>
+      </w:tr>
+      <w:tr>
+        <w:tc>
+          <w:tcPr>
+            <w:tcW w:type="dxa" w:w="576"/>
+            <w:shd w:val="clear" w:color="auto" w:fill="F5F5F5"/>
+          </w:tcPr>
+          <w:p>
+            <w:r>
+              <w:rPr>
+                <w:sz w:val="16"/>
+              </w:rPr>
+              <w:t xml:space="preserve">A.2</w:t>
+            </w:r>
+          </w:p>
+        </w:tc>
+        <w:tc>
+          <w:tcPr>
+            <w:tcW w:type="dxa" w:w="1296"/>
+            <w:shd w:val="clear" w:color="auto" w:fill="F5F5F5"/>
+          </w:tcPr>
+          <w:p>
+            <w:r>
+              <w:rPr>
+                <w:sz w:val="16"/>
+              </w:rPr>
+              <w:t xml:space="preserve">2026-05-10</w:t>
+            </w:r>
+          </w:p>
+        </w:tc>
+        <w:tc>
+          <w:tcPr>
+            <w:tcW w:type="dxa" w:w="2160"/>
+            <w:shd w:val="clear" w:color="auto" w:fill="F5F5F5"/>
+          </w:tcPr>
+          <w:p>
+            <w:r>
+              <w:rPr>
+                <w:sz w:val="16"/>
+              </w:rPr>
+              <w:t xml:space="preserve">NeuroPulse Engineering</w:t>
+            </w:r>
+          </w:p>
+        </w:tc>
+        <w:tc>
+          <w:tcPr>
+            <w:tcW w:type="dxa" w:w="5760"/>
+            <w:shd w:val="clear" w:color="auto" w:fill="F5F5F5"/>
+          </w:tcPr>
+          <w:p>
+            <w:r>
+              <w:rPr>
+                <w:sz w:val="16"/>
+              </w:rPr>
+              <w:t xml:space="preserve">G2-11 CLOSED — EEG cable routing path locked in NP-DRV-SHELL-001 Rev B §2.4.5. OI-09 closed. DRC-22 and DRC-23 CLOSED. Summary status dashboard updated.</w:t>
+            </w:r>
+            <w:r>
+              <w:rPr>
+                <w:b w:val="0"/>
+                <w:sz w:val="16"/>
+              </w:rPr>
+              <w:t/>
             </w:r>
           </w:p>
         </w:tc>

</xml_diff>

<commit_message>
NP-COORD-001 Rev A.9: fix table format consistency + add color key
- Fixed 8 rows with 5-column format in 7-column detail tables
  (G1-13, G1-14, G2-10, G2-11, G2-12, G2-14, G3-07, G3-08)
- Fixed G1-06 detail row (status text was in Gate column)
- Abbreviated summary dashboard rows G2-02, G2-13, G2-14
- Added status color coding key before summary dashboard
- Corrected G1-06 summary shading to CLOSED (green)
- Updated header to Rev A.9, added revision history entry
</commit_message>
<xml_diff>
--- a/docs/neuropulse_eng_coordination_checklist.docx
+++ b/docs/neuropulse_eng_coordination_checklist.docx
@@ -34,11 +34,7 @@
         <w:jc w:val="center"/>
       </w:pPr>
       <w:r>
-        <w:rPr>
-          <w:color w:val="555555"/>
-          <w:sz w:val="18"/>
-        </w:rPr>
-        <w:t>NP-COORD-001  Rev A.8  |  2026-05-11  |  Pre-Layout / Pre-Tooling Draft</w:t>
+        <w:t>NP-COORD-001  Rev A.9  |  2026-05-11  |  Pre-Layout / Pre-Tooling Draft</w:t>
         <w:br/>
         <w:t>References: NP-HW-FPC-001 Rev C · NP-PROC-FPC-001 Rev A · NP-DRV-SHELL-001 Rev A · NP-FAI-ZM-001 Rev A · NP-FW-EMMC-001 Rev A</w:t>
         <w:br/>
@@ -1336,21 +1332,13 @@
         <w:tc>
           <w:tcPr>
             <w:tcW w:type="dxa" w:w="864"/>
+            <w:shd w:val="clear" w:color="auto" w:fill="E2EFDA"/>
             <w:shd w:val="clear" w:color="auto" w:fill="F5F5F5"/>
-            <w:shd w:val="clear" w:color="auto" w:fill="E2EFDA"/>
-          </w:tcPr>
-          <w:p>
-            <w:r>
-              <w:rPr>
-                <w:sz w:val="16"/>
-              </w:rPr>
-            </w:r>
-            <w:r>
-              <w:rPr>
-                <w:b w:val="0"/>
-                <w:sz w:val="16"/>
-              </w:rPr>
-              <w:t>CLOSED — Option B selected; pin 19 assigned PD2_CATHODE; §8.4 added to NP-HW-FPC-001</w:t>
+          </w:tcPr>
+          <w:p>
+            <w:r/>
+            <w:r>
+              <w:t>G1</w:t>
             </w:r>
           </w:p>
         </w:tc>
@@ -1371,14 +1359,12 @@
         <w:tc>
           <w:tcPr>
             <w:tcW w:type="dxa" w:w="1008"/>
-            <w:shd w:val="clear" w:color="auto" w:fill="FFE699"/>
-          </w:tcPr>
-          <w:p>
-            <w:r>
-              <w:rPr>
-                <w:sz w:val="16"/>
-              </w:rPr>
-              <w:t>OPEN — design decision required</w:t>
+            <w:shd w:val="clear" w:color="auto" w:fill="E2EFDA"/>
+          </w:tcPr>
+          <w:p>
+            <w:r/>
+            <w:r>
+              <w:t>CLOSED — Option B selected; pin 19 assigned PD2_CATHODE; §8.4 added to NP-HW-FPC-001</w:t>
             </w:r>
           </w:p>
         </w:tc>
@@ -1386,71 +1372,72 @@
       <w:tr>
         <w:tc>
           <w:tcPr>
+            <w:tcW w:w="792" w:type="dxa"/>
+          </w:tcPr>
+          <w:p>
+            <w:r>
+              <w:t xml:space="preserve">G1-13</w:t>
+            </w:r>
+          </w:p>
+        </w:tc>
+        <w:tc>
+          <w:tcPr>
+            <w:tcW w:w="1656" w:type="dxa"/>
+          </w:tcPr>
+          <w:p>
+            <w:r>
+              <w:t xml:space="preserve">EE</w:t>
+            </w:r>
+          </w:p>
+        </w:tc>
+        <w:tc>
+          <w:tcPr>
+            <w:tcW w:w="3240" w:type="dxa"/>
+          </w:tcPr>
+          <w:p>
+            <w:r>
+              <w:t xml:space="preserve">ZONE_ID firmware debounce specification: 3× ADC reads at 100 ms intervals before FAULT assertion on pin 18. Accept: ≥2/3 reads in valid band. Ref: RISK-18. NP-HW-FPC-001 §11.4.</w:t>
+            </w:r>
+          </w:p>
+        </w:tc>
+        <w:tc>
+          <w:tcPr>
+            <w:tcW w:w="2664" w:type="dxa"/>
+          </w:tcPr>
+          <w:p>
+            <w:r>
+              <w:t xml:space="preserve">NP-FW-REQ-001 Rev A §3 (ZONE_ID debounce algorithm FW-DBC-01–08, ADC spec FW-ADC-01–05).</w:t>
+            </w:r>
+          </w:p>
+        </w:tc>
+        <w:tc>
+          <w:tcPr>
+            <w:tcW w:w="864" w:type="dxa"/>
+          </w:tcPr>
+          <w:p>
+            <w:r>
+              <w:t xml:space="preserve">G1</w:t>
+            </w:r>
+          </w:p>
+        </w:tc>
+        <w:tc>
+          <w:tcPr>
             <w:tcW w:w="936" w:type="dxa"/>
           </w:tcPr>
           <w:p>
             <w:r>
-              <w:rPr>
-                <w:b/>
-                <w:sz w:val="16"/>
-              </w:rPr>
-            </w:r>
-            <w:r>
-              <w:rPr>
-                <w:b/>
-                <w:sz w:val="16"/>
-              </w:rPr>
-              <w:t>G1-13</w:t>
-            </w:r>
-          </w:p>
-        </w:tc>
-        <w:tc>
-          <w:tcPr>
-            <w:tcW w:w="792" w:type="dxa"/>
-          </w:tcPr>
-          <w:p>
-            <w:r>
-              <w:rPr>
-                <w:sz w:val="16"/>
-              </w:rPr>
-              <w:t xml:space="preserve">G1</w:t>
-            </w:r>
-          </w:p>
-        </w:tc>
-        <w:tc>
-          <w:tcPr>
-            <w:tcW w:w="5040" w:type="dxa"/>
-          </w:tcPr>
-          <w:p>
-            <w:r>
-              <w:rPr>
-                <w:sz w:val="16"/>
-              </w:rPr>
-              <w:t xml:space="preserve">ZONE_ID firmware debounce specification: EE to add to firmware requirements document — 3× ADC reads at 100 ms intervals before FAULT assertion on pin 18. Accept: ≥2/3 reads in valid band. FAULT: all 3 reads fail. Audio alert text: 'Zone module contact issue — remove and reinsert'. Ref: RISK-18 mitigation. NP-HW-FPC-001 §11.4.</w:t>
-            </w:r>
-          </w:p>
-        </w:tc>
-        <w:tc>
-          <w:tcPr>
-            <w:tcW w:w="1296" w:type="dxa"/>
-          </w:tcPr>
-          <w:p>
-            <w:r>
-              <w:rPr>
-                <w:sz w:val="16"/>
-              </w:rPr>
-              <w:t xml:space="preserve">EE</w:t>
-            </w:r>
-          </w:p>
-        </w:tc>
-        <w:tc>
-          <w:tcPr>
-            <w:tcW w:w="1728" w:type="dxa"/>
+              <w:t xml:space="preserve">RISK-18</w:t>
+            </w:r>
+          </w:p>
+        </w:tc>
+        <w:tc>
+          <w:tcPr>
+            <w:tcW w:w="1008" w:type="dxa"/>
             <w:shd w:val="clear" w:color="auto" w:fill="E2EFDA"/>
           </w:tcPr>
           <w:p>
             <w:r>
-              <w:t>CLOSED — NP-FW-REQ-001 Rev A §3 (ZONE_ID debounce algorithm FW-DBC-01–08, ADC spec FW-ADC-01–05, FAULT state, audio alerts FW-AUD-01–02). 2026-05-10</w:t>
+              <w:t xml:space="preserve">CLOSED — NP-FW-REQ-001 Rev A. 2026-05-10</w:t>
             </w:r>
           </w:p>
         </w:tc>
@@ -1458,73 +1445,77 @@
       <w:tr>
         <w:tc>
           <w:tcPr>
+            <w:tcW w:w="792" w:type="dxa"/>
+            <w:shd w:val="clear" w:color="auto" w:fill="F5F5F5"/>
+          </w:tcPr>
+          <w:p>
+            <w:r>
+              <w:t xml:space="preserve">G1-14</w:t>
+            </w:r>
+          </w:p>
+        </w:tc>
+        <w:tc>
+          <w:tcPr>
+            <w:tcW w:w="1656" w:type="dxa"/>
+            <w:shd w:val="clear" w:color="auto" w:fill="F5F5F5"/>
+          </w:tcPr>
+          <w:p>
+            <w:r>
+              <w:t xml:space="preserve">Mfg Eng + HW EE</w:t>
+            </w:r>
+          </w:p>
+        </w:tc>
+        <w:tc>
+          <w:tcPr>
+            <w:tcW w:w="3240" w:type="dxa"/>
+            <w:shd w:val="clear" w:color="auto" w:fill="F5F5F5"/>
+          </w:tcPr>
+          <w:p>
+            <w:r>
+              <w:t xml:space="preserve">[BLOCKING] PDMS process qualification must pass before zone module tooling is released. FAI-TC02 (200-cycle IEC 60068-2-14) and FAI-TC03 (peel force ≥150 N/m). CAT-C supplier required. Ref: RISK-04.</w:t>
+            </w:r>
+          </w:p>
+        </w:tc>
+        <w:tc>
+          <w:tcPr>
+            <w:tcW w:w="2664" w:type="dxa"/>
+            <w:shd w:val="clear" w:color="auto" w:fill="F5F5F5"/>
+          </w:tcPr>
+          <w:p>
+            <w:r>
+              <w:t xml:space="preserve">NP-QR-PDMS-001 thermal cycling qualification report. Minimum 10 coupons. CAT-C supplier selected per NP-PROC-SUP-001.</w:t>
+            </w:r>
+          </w:p>
+        </w:tc>
+        <w:tc>
+          <w:tcPr>
+            <w:tcW w:w="864" w:type="dxa"/>
+            <w:shd w:val="clear" w:color="auto" w:fill="F5F5F5"/>
+          </w:tcPr>
+          <w:p>
+            <w:r>
+              <w:t xml:space="preserve">G1</w:t>
+            </w:r>
+          </w:p>
+        </w:tc>
+        <w:tc>
+          <w:tcPr>
             <w:tcW w:w="936" w:type="dxa"/>
-          </w:tcPr>
-          <w:p>
-            <w:r>
-              <w:rPr>
-                <w:b/>
-                <w:sz w:val="16"/>
-              </w:rPr>
-            </w:r>
-            <w:r>
-              <w:rPr>
-                <w:b/>
-                <w:sz w:val="16"/>
-              </w:rPr>
-              <w:t>G1-14</w:t>
-            </w:r>
-          </w:p>
-        </w:tc>
-        <w:tc>
-          <w:tcPr>
-            <w:tcW w:w="792" w:type="dxa"/>
-          </w:tcPr>
-          <w:p>
-            <w:r>
-              <w:rPr>
-                <w:sz w:val="16"/>
-              </w:rPr>
-              <w:t xml:space="preserve">G1</w:t>
-            </w:r>
-          </w:p>
-        </w:tc>
-        <w:tc>
-          <w:tcPr>
-            <w:tcW w:w="5040" w:type="dxa"/>
-          </w:tcPr>
-          <w:p>
-            <w:r>
-              <w:rPr>
-                <w:sz w:val="16"/>
-              </w:rPr>
-              <w:t xml:space="preserve">[BLOCKING] PDMS process qualification must pass before zone module tooling is released. Required: NP-FAI-ZM-001 §3e FAI-TC02 (200-cycle IEC 60068-2-14 thermal cycling) and FAI-TC03 (post-cycle peel force ≥ 150 N/m) completed and signed off in NP-QR-PDMS-001. Owner: Manufacturing Eng + HW EE. Supplier (CAT-C) must be selected and process control plan approved before qualification samples can be made. Ref: RISK-04.</w:t>
-            </w:r>
-          </w:p>
-        </w:tc>
-        <w:tc>
-          <w:tcPr>
-            <w:tcW w:w="1296" w:type="dxa"/>
-          </w:tcPr>
-          <w:p>
-            <w:r>
-              <w:rPr>
-                <w:sz w:val="16"/>
-              </w:rPr>
-              <w:t xml:space="preserve">Mfg Eng + HW EE</w:t>
-            </w:r>
-          </w:p>
-        </w:tc>
-        <w:tc>
-          <w:tcPr>
-            <w:tcW w:w="1728" w:type="dxa"/>
-            <w:shd w:val="clear" w:color="auto" w:fill="FFF2CC"/>
-          </w:tcPr>
-          <w:p>
-            <w:r>
-              <w:rPr>
-                <w:sz w:val="16"/>
-              </w:rPr>
+            <w:shd w:val="clear" w:color="auto" w:fill="F5F5F5"/>
+          </w:tcPr>
+          <w:p>
+            <w:r>
+              <w:t xml:space="preserve">RISK-04</w:t>
+            </w:r>
+          </w:p>
+        </w:tc>
+        <w:tc>
+          <w:tcPr>
+            <w:tcW w:w="1008" w:type="dxa"/>
+            <w:shd w:val="clear" w:color="auto" w:fill="FFE699"/>
+          </w:tcPr>
+          <w:p>
+            <w:r>
               <w:t xml:space="preserve">OPEN — CAT-C supplier not yet selected</w:t>
             </w:r>
           </w:p>
@@ -4105,67 +4096,72 @@
       <w:tr>
         <w:tc>
           <w:tcPr>
+            <w:tcW w:w="792" w:type="dxa"/>
+          </w:tcPr>
+          <w:p>
+            <w:r>
+              <w:t xml:space="preserve">G2-10</w:t>
+            </w:r>
+          </w:p>
+        </w:tc>
+        <w:tc>
+          <w:tcPr>
+            <w:tcW w:w="1656" w:type="dxa"/>
+          </w:tcPr>
+          <w:p>
+            <w:r>
+              <w:t xml:space="preserve">FW + HW EE</w:t>
+            </w:r>
+          </w:p>
+        </w:tc>
+        <w:tc>
+          <w:tcPr>
+            <w:tcW w:w="3240" w:type="dxa"/>
+          </w:tcPr>
+          <w:p>
+            <w:r>
+              <w:t xml:space="preserve">Audio zone ID confirmation via bone conduction — spoken zone name on insert/wrong-module alert (RISK-15 Layer 5). Five parallel slot state machines; DDS audio synthesis; 3×100ms debounce (RISK-18).</w:t>
+            </w:r>
+          </w:p>
+        </w:tc>
+        <w:tc>
+          <w:tcPr>
+            <w:tcW w:w="2664" w:type="dxa"/>
+          </w:tcPr>
+          <w:p>
+            <w:r>
+              <w:t xml:space="preserve">NP-FW-ZA-001 Rev A baselined. Zone module bone conduction announcement firmware (firmware/zone_announce/).</w:t>
+            </w:r>
+          </w:p>
+        </w:tc>
+        <w:tc>
+          <w:tcPr>
             <w:tcW w:w="864" w:type="dxa"/>
           </w:tcPr>
           <w:p>
             <w:r>
-              <w:rPr>
-                <w:sz w:val="16"/>
-              </w:rPr>
-              <w:t xml:space="preserve">G2-10</w:t>
-            </w:r>
-          </w:p>
-        </w:tc>
-        <w:tc>
-          <w:tcPr>
-            <w:tcW w:w="720" w:type="dxa"/>
-          </w:tcPr>
-          <w:p>
-            <w:r>
-              <w:rPr>
-                <w:sz w:val="16"/>
-              </w:rPr>
               <w:t xml:space="preserve">G2</w:t>
             </w:r>
           </w:p>
         </w:tc>
         <w:tc>
           <w:tcPr>
-            <w:tcW w:w="1944" w:type="dxa"/>
-          </w:tcPr>
-          <w:p>
-            <w:r>
-              <w:rPr>
-                <w:sz w:val="16"/>
-              </w:rPr>
-              <w:t xml:space="preserve">FW + HW EE</w:t>
-            </w:r>
-          </w:p>
-        </w:tc>
-        <w:tc>
-          <w:tcPr>
-            <w:tcW w:w="5760" w:type="dxa"/>
-          </w:tcPr>
-          <w:p>
-            <w:r>
-              <w:rPr>
-                <w:sz w:val="16"/>
-              </w:rPr>
-              <w:t xml:space="preserve">Audio zone ID confirmation via bone conduction — spoken zone name on insert/wrong-module alert (RISK-15 Layer 5)</w:t>
-            </w:r>
-          </w:p>
-        </w:tc>
-        <w:tc>
-          <w:tcPr>
-            <w:tcW w:w="1224" w:type="dxa"/>
-            <w:shd w:val="clear" w:color="auto" w:fill="FFE699"/>
-          </w:tcPr>
-          <w:p>
-            <w:r>
-              <w:rPr>
-                <w:sz w:val="16"/>
-              </w:rPr>
-              <w:t>CLOSED — NP-FW-ZA-001 Rev A baselined 2026-05-11. Zone module bone conduction announcement firmware written (firmware/zone_announce/). Five parallel slot state machines; DDS audio synthesis from 256-entry Q15 sine LUT via SAI3 I2S at 8kHz; 3×100ms debounce (RISK-18). G2-10 CLOSED. Closes Issue #22.</w:t>
+            <w:tcW w:w="936" w:type="dxa"/>
+          </w:tcPr>
+          <w:p>
+            <w:r>
+              <w:t xml:space="preserve">RISK-15 / RISK-18</w:t>
+            </w:r>
+          </w:p>
+        </w:tc>
+        <w:tc>
+          <w:tcPr>
+            <w:tcW w:w="1008" w:type="dxa"/>
+            <w:shd w:val="clear" w:color="auto" w:fill="E2EFDA"/>
+          </w:tcPr>
+          <w:p>
+            <w:r>
+              <w:t xml:space="preserve">CLOSED — NP-FW-ZA-001 Rev A baselined 2026-05-11. Closes Issue #22.</w:t>
             </w:r>
           </w:p>
         </w:tc>
@@ -4173,68 +4169,78 @@
       <w:tr>
         <w:tc>
           <w:tcPr>
+            <w:tcW w:w="792" w:type="dxa"/>
+            <w:shd w:val="clear" w:color="auto" w:fill="F5F5F5"/>
+          </w:tcPr>
+          <w:p>
+            <w:r>
+              <w:t xml:space="preserve">G2-11</w:t>
+            </w:r>
+          </w:p>
+        </w:tc>
+        <w:tc>
+          <w:tcPr>
+            <w:tcW w:w="1656" w:type="dxa"/>
+            <w:shd w:val="clear" w:color="auto" w:fill="F5F5F5"/>
+          </w:tcPr>
+          <w:p>
+            <w:r>
+              <w:t xml:space="preserve">EE + ME</w:t>
+            </w:r>
+          </w:p>
+        </w:tc>
+        <w:tc>
+          <w:tcPr>
+            <w:tcW w:w="3240" w:type="dxa"/>
+            <w:shd w:val="clear" w:color="auto" w:fill="F5F5F5"/>
+          </w:tcPr>
+          <w:p>
+            <w:r>
+              <w:t xml:space="preserve">EEG cable routing path inside shell — NP-DRV-SHELL-001 §2.4 before tooling release. Required to verify DRC-18 (≥15 mm FPC-to-EEG separation). Ref: RISK-21.</w:t>
+            </w:r>
+          </w:p>
+        </w:tc>
+        <w:tc>
+          <w:tcPr>
+            <w:tcW w:w="2664" w:type="dxa"/>
+            <w:shd w:val="clear" w:color="auto" w:fill="F5F5F5"/>
+          </w:tcPr>
+          <w:p>
+            <w:r>
+              <w:t xml:space="preserve">NP-DRV-SHELL-001 Rev B §2.4.5 routing diagram + DRC-18 pass confirmation in CAD.</w:t>
+            </w:r>
+          </w:p>
+        </w:tc>
+        <w:tc>
+          <w:tcPr>
+            <w:tcW w:w="864" w:type="dxa"/>
+            <w:shd w:val="clear" w:color="auto" w:fill="F5F5F5"/>
+          </w:tcPr>
+          <w:p>
+            <w:r>
+              <w:t xml:space="preserve">G2</w:t>
+            </w:r>
+          </w:p>
+        </w:tc>
+        <w:tc>
+          <w:tcPr>
             <w:tcW w:w="936" w:type="dxa"/>
-          </w:tcPr>
-          <w:p>
-            <w:r>
-              <w:rPr>
-                <w:b/>
-                <w:sz w:val="16"/>
-              </w:rPr>
-              <w:t xml:space="preserve">G2-11</w:t>
-            </w:r>
-          </w:p>
-        </w:tc>
-        <w:tc>
-          <w:tcPr>
-            <w:tcW w:w="792" w:type="dxa"/>
-          </w:tcPr>
-          <w:p>
-            <w:r>
-              <w:rPr>
-                <w:sz w:val="16"/>
-              </w:rPr>
-              <w:t xml:space="preserve">G2</w:t>
-            </w:r>
-          </w:p>
-        </w:tc>
-        <w:tc>
-          <w:tcPr>
-            <w:tcW w:w="5040" w:type="dxa"/>
-          </w:tcPr>
-          <w:p>
-            <w:r>
-              <w:rPr>
-                <w:sz w:val="16"/>
-              </w:rPr>
-              <w:t xml:space="preserve">EEG cable routing path inside shell must be specified and documented in NP-DRV-SHELL-001 §2.4 before tooling release. Required to verify DRC-18 (≥15 mm FPC-to-EEG separation). [BLOCKING — tooling must not be released without this.] Owner: EE + ME joint. Deliverable: §2.4 routing diagram + DRC-18 pass confirmation in CAD. Ref: RISK-21.</w:t>
-            </w:r>
-          </w:p>
-        </w:tc>
-        <w:tc>
-          <w:tcPr>
-            <w:tcW w:w="1296" w:type="dxa"/>
-          </w:tcPr>
-          <w:p>
-            <w:r>
-              <w:rPr>
-                <w:sz w:val="16"/>
-              </w:rPr>
-              <w:t xml:space="preserve">EE + ME</w:t>
-            </w:r>
-          </w:p>
-        </w:tc>
-        <w:tc>
-          <w:tcPr>
-            <w:tcW w:w="1728" w:type="dxa"/>
-            <w:shd w:val="clear" w:color="auto" w:fill="FFF2CC"/>
-          </w:tcPr>
-          <w:p>
-            <w:r>
-              <w:rPr>
-                <w:sz w:val="16"/>
-              </w:rPr>
-              <w:t>CLOSED — NP-DRV-SHELL-001 Rev B §2.4.5 (2026-05-10). EEG cable routing path locked; OI-09 closed; DRC-22 and DRC-23 CLOSED. 8×5mm main trunk + 6×4mm branch channels specified in shell CAD; spec handed to tooling supplier. DRC-18 verified (18–22mm separation).</w:t>
+            <w:shd w:val="clear" w:color="auto" w:fill="F5F5F5"/>
+          </w:tcPr>
+          <w:p>
+            <w:r>
+              <w:t xml:space="preserve">RISK-21</w:t>
+            </w:r>
+          </w:p>
+        </w:tc>
+        <w:tc>
+          <w:tcPr>
+            <w:tcW w:w="1008" w:type="dxa"/>
+            <w:shd w:val="clear" w:color="auto" w:fill="E2EFDA"/>
+          </w:tcPr>
+          <w:p>
+            <w:r>
+              <w:t xml:space="preserve">CLOSED — NP-DRV-SHELL-001 Rev B §2.4.5 (2026-05-10). OI-09 closed; DRC-22/23 CLOSED. 18–22mm separation.</w:t>
             </w:r>
           </w:p>
         </w:tc>
@@ -4242,68 +4248,72 @@
       <w:tr>
         <w:tc>
           <w:tcPr>
+            <w:tcW w:w="792" w:type="dxa"/>
+          </w:tcPr>
+          <w:p>
+            <w:r>
+              <w:t xml:space="preserve">G2-12</w:t>
+            </w:r>
+          </w:p>
+        </w:tc>
+        <w:tc>
+          <w:tcPr>
+            <w:tcW w:w="1656" w:type="dxa"/>
+          </w:tcPr>
+          <w:p>
+            <w:r>
+              <w:t xml:space="preserve">FW + HW EE</w:t>
+            </w:r>
+          </w:p>
+        </w:tc>
+        <w:tc>
+          <w:tcPr>
+            <w:tcW w:w="3240" w:type="dxa"/>
+          </w:tcPr>
+          <w:p>
+            <w:r>
+              <w:t xml:space="preserve">HRV biofeedback firmware spec — coherence algorithm, taVNS timing, dual EEG+HRV display. Six-module library.</w:t>
+            </w:r>
+          </w:p>
+        </w:tc>
+        <w:tc>
+          <w:tcPr>
+            <w:tcW w:w="2664" w:type="dxa"/>
+          </w:tcPr>
+          <w:p>
+            <w:r>
+              <w:t xml:space="preserve">NP-FW-HRV-001 Rev A baselined. HRV biofeedback firmware (firmware/hrv_biofeedback/).</w:t>
+            </w:r>
+          </w:p>
+        </w:tc>
+        <w:tc>
+          <w:tcPr>
+            <w:tcW w:w="864" w:type="dxa"/>
+          </w:tcPr>
+          <w:p>
+            <w:r>
+              <w:t xml:space="preserve">G2</w:t>
+            </w:r>
+          </w:p>
+        </w:tc>
+        <w:tc>
+          <w:tcPr>
             <w:tcW w:w="936" w:type="dxa"/>
           </w:tcPr>
           <w:p>
             <w:r>
-              <w:rPr>
-                <w:sz w:val="16"/>
-                <w:b/>
-              </w:rPr>
-              <w:t xml:space="preserve">G2-12</w:t>
-            </w:r>
-          </w:p>
-        </w:tc>
-        <w:tc>
-          <w:tcPr>
-            <w:tcW w:w="792" w:type="dxa"/>
-          </w:tcPr>
-          <w:p>
-            <w:r>
-              <w:rPr>
-                <w:sz w:val="16"/>
-              </w:rPr>
-              <w:t xml:space="preserve">G2</w:t>
-            </w:r>
-          </w:p>
-        </w:tc>
-        <w:tc>
-          <w:tcPr>
-            <w:tcW w:w="1872" w:type="dxa"/>
-          </w:tcPr>
-          <w:p>
-            <w:r>
-              <w:rPr>
-                <w:sz w:val="16"/>
-              </w:rPr>
-              <w:t xml:space="preserve">FW + HW EE</w:t>
-            </w:r>
-          </w:p>
-        </w:tc>
-        <w:tc>
-          <w:tcPr>
-            <w:tcW w:w="4031" w:type="dxa"/>
-          </w:tcPr>
-          <w:p>
-            <w:r>
-              <w:rPr>
-                <w:sz w:val="16"/>
-              </w:rPr>
-              <w:t xml:space="preserve">HRV biofeedback firmware spec — coherence algo, taVNS timing, dual EEG+HRV display</w:t>
-            </w:r>
-          </w:p>
-        </w:tc>
-        <w:tc>
-          <w:tcPr>
-            <w:tcW w:w="2015" w:type="dxa"/>
-            <w:shd w:val="clear" w:color="auto" w:fill="FFF2CC"/>
-          </w:tcPr>
-          <w:p>
-            <w:r>
-              <w:rPr>
-                <w:sz w:val="16"/>
-              </w:rPr>
-              <w:t>CLOSED — NP-FW-HRV-001 Rev A baselined 2026-05-11. HRV biofeedback firmware written (firmware/hrv_biofeedback/). Six-module library: ppg, coherence (256-pt Welch PSD), pacer, tavns_sync, eeg_biofeedback, session. Four protocols including taVNS synchronised stimulation. G2-12 CLOSED. Closes Issue #21.</w:t>
+              <w:t xml:space="preserve">RISK-14 / RISK-13</w:t>
+            </w:r>
+          </w:p>
+        </w:tc>
+        <w:tc>
+          <w:tcPr>
+            <w:tcW w:w="1008" w:type="dxa"/>
+            <w:shd w:val="clear" w:color="auto" w:fill="E2EFDA"/>
+          </w:tcPr>
+          <w:p>
+            <w:r>
+              <w:t xml:space="preserve">CLOSED — NP-FW-HRV-001 Rev A baselined 2026-05-11. Closes Issue #21.</w:t>
             </w:r>
           </w:p>
         </w:tc>
@@ -4311,52 +4321,78 @@
       <w:tr>
         <w:tc>
           <w:tcPr>
+            <w:tcW w:w="792" w:type="dxa"/>
+            <w:shd w:val="clear" w:color="auto" w:fill="F5F5F5"/>
+          </w:tcPr>
+          <w:p>
+            <w:r>
+              <w:t xml:space="preserve">G2-14</w:t>
+            </w:r>
+          </w:p>
+        </w:tc>
+        <w:tc>
+          <w:tcPr>
+            <w:tcW w:w="1656" w:type="dxa"/>
+            <w:shd w:val="clear" w:color="auto" w:fill="F5F5F5"/>
+          </w:tcPr>
+          <w:p>
+            <w:r>
+              <w:t xml:space="preserve">Firmware Lead + Systems Eng</w:t>
+            </w:r>
+          </w:p>
+        </w:tc>
+        <w:tc>
+          <w:tcPr>
+            <w:tcW w:w="3240" w:type="dxa"/>
+            <w:shd w:val="clear" w:color="auto" w:fill="F5F5F5"/>
+          </w:tcPr>
+          <w:p>
+            <w:r>
+              <w:t xml:space="preserve">Hub control program (NP-FW-HUB-001 Rev A) — main application firmware for i.MX RT1062. Four FreeRTOS tasks: module probe, protocol runner, telemetry, safety SPI heartbeat.</w:t>
+            </w:r>
+          </w:p>
+        </w:tc>
+        <w:tc>
+          <w:tcPr>
+            <w:tcW w:w="2664" w:type="dxa"/>
+            <w:shd w:val="clear" w:color="auto" w:fill="F5F5F5"/>
+          </w:tcPr>
+          <w:p>
+            <w:r>
+              <w:t xml:space="preserve">NP-FW-HUB-001 Rev A written (firmware/hub_control/). T1 modules connected. T2 stubs present. HAL stubs pending prototype.</w:t>
+            </w:r>
+          </w:p>
+        </w:tc>
+        <w:tc>
+          <w:tcPr>
+            <w:tcW w:w="864" w:type="dxa"/>
+            <w:shd w:val="clear" w:color="auto" w:fill="F5F5F5"/>
+          </w:tcPr>
+          <w:p>
+            <w:r>
+              <w:t xml:space="preserve">G2</w:t>
+            </w:r>
+          </w:p>
+        </w:tc>
+        <w:tc>
+          <w:tcPr>
             <w:tcW w:w="936" w:type="dxa"/>
-          </w:tcPr>
-          <w:p>
-            <w:r>
-              <w:t>G2-14</w:t>
-            </w:r>
-          </w:p>
-        </w:tc>
-        <w:tc>
-          <w:tcPr>
-            <w:tcW w:w="792" w:type="dxa"/>
-          </w:tcPr>
-          <w:p>
-            <w:r>
-              <w:t>G2</w:t>
-            </w:r>
-          </w:p>
-        </w:tc>
-        <w:tc>
-          <w:tcPr>
-            <w:tcW w:w="1872" w:type="dxa"/>
-          </w:tcPr>
-          <w:p>
-            <w:r>
-              <w:t xml:space="preserve">Firmware Lead + Systems Eng</w:t>
-            </w:r>
-          </w:p>
-        </w:tc>
-        <w:tc>
-          <w:tcPr>
-            <w:tcW w:w="4031" w:type="dxa"/>
-          </w:tcPr>
-          <w:p>
-            <w:r>
-              <w:t xml:space="preserve">Hub control program (NP-FW-HUB-001 Rev A) — main application firmware for NXP i.MX RT1062 hub processor. Four FreeRTOS tasks: (1) module probe — scans all slots and accessory ports, populates module registry; (2) protocol runner — receives Ed25519-signed binary protocol, dispatches commands by start_ms; (3) telemetry — collects per-module telemetry every second, routes to UHDR/SHDR per 27-element classification table; (4) safety SPI heartbeat — 200ms heartbeat to Safety MCU carrying requested-enable bitmask. T2 module stubs registered but return NOT_PRESENT until hardware drivers built.</w:t>
-            </w:r>
-          </w:p>
-        </w:tc>
-        <w:tc>
-          <w:tcPr>
-            <w:tcW w:w="2015" w:type="dxa"/>
+            <w:shd w:val="clear" w:color="auto" w:fill="F5F5F5"/>
+          </w:tcPr>
+          <w:p>
+            <w:r>
+              <w:t xml:space="preserve">—</w:t>
+            </w:r>
+          </w:p>
+        </w:tc>
+        <w:tc>
+          <w:tcPr>
+            <w:tcW w:w="1008" w:type="dxa"/>
             <w:shd w:val="clear" w:color="auto" w:fill="FFF2CC"/>
           </w:tcPr>
           <w:p>
             <w:r>
-              <w:t xml:space="preserve">PARTIAL — NP-FW-HUB-001 Rev A written (firmware/hub_control/, 2026-05-16). T1 module registry probing all 11 slots. Protocol runner, telemetry, safety SPI heartbeat implemented. T2 stubs registered (return NOT_PRESENT). HAL stubs for T2 hardware drivers PENDING. Predefined protocol library (19 protocols, docs/npps-reference.md) ready. Full gate closure requires HAL stub connections to prototype hardware.</w:t>
+              <w:t xml:space="preserve">PARTIAL — firmware written 2026-05-16. HAL stubs pending prototype hardware.</w:t>
             </w:r>
           </w:p>
         </w:tc>
@@ -5168,68 +5204,72 @@
       <w:tr>
         <w:tc>
           <w:tcPr>
+            <w:tcW w:w="792" w:type="dxa"/>
+          </w:tcPr>
+          <w:p>
+            <w:r>
+              <w:t xml:space="preserve">G3-07</w:t>
+            </w:r>
+          </w:p>
+        </w:tc>
+        <w:tc>
+          <w:tcPr>
+            <w:tcW w:w="1656" w:type="dxa"/>
+          </w:tcPr>
+          <w:p>
+            <w:r>
+              <w:t xml:space="preserve">EE + FW</w:t>
+            </w:r>
+          </w:p>
+        </w:tc>
+        <w:tc>
+          <w:tcPr>
+            <w:tcW w:w="3240" w:type="dxa"/>
+          </w:tcPr>
+          <w:p>
+            <w:r>
+              <w:t xml:space="preserve">sLORETA-guided HD-tDCS T2: (1) dual-rated Ag/AgCl electrodes; (2) sLORETA-to-10-20 mapping (FAI-HD01); (3) 4×1 montage (FAI-HD02–HD03); (4) EEG+tDCS SNR (FAI-HD04).</w:t>
+            </w:r>
+          </w:p>
+        </w:tc>
+        <w:tc>
+          <w:tcPr>
+            <w:tcW w:w="2664" w:type="dxa"/>
+          </w:tcPr>
+          <w:p>
+            <w:r>
+              <w:t xml:space="preserve">NP-FW-HD-001 Rev A. Firmware (firmware/sloreta_hdtdcs/). FAI-HD02 SOFTWARE PASS. Hardware FAI pending T2 prototype.</w:t>
+            </w:r>
+          </w:p>
+        </w:tc>
+        <w:tc>
+          <w:tcPr>
+            <w:tcW w:w="864" w:type="dxa"/>
+          </w:tcPr>
+          <w:p>
+            <w:r>
+              <w:t xml:space="preserve">G3</w:t>
+            </w:r>
+          </w:p>
+        </w:tc>
+        <w:tc>
+          <w:tcPr>
             <w:tcW w:w="936" w:type="dxa"/>
           </w:tcPr>
           <w:p>
             <w:r>
-              <w:rPr>
-                <w:b/>
-                <w:sz w:val="16"/>
-              </w:rPr>
-              <w:t xml:space="preserve">G3-07</w:t>
-            </w:r>
-          </w:p>
-        </w:tc>
-        <w:tc>
-          <w:tcPr>
-            <w:tcW w:w="792" w:type="dxa"/>
-          </w:tcPr>
-          <w:p>
-            <w:r>
-              <w:rPr>
-                <w:sz w:val="16"/>
-              </w:rPr>
-              <w:t xml:space="preserve">G3</w:t>
-            </w:r>
-          </w:p>
-        </w:tc>
-        <w:tc>
-          <w:tcPr>
-            <w:tcW w:w="1872" w:type="dxa"/>
-          </w:tcPr>
-          <w:p>
-            <w:r>
-              <w:rPr>
-                <w:sz w:val="16"/>
-              </w:rPr>
-              <w:t xml:space="preserve">EE + FW</w:t>
-            </w:r>
-          </w:p>
-        </w:tc>
-        <w:tc>
-          <w:tcPr>
-            <w:tcW w:w="4031" w:type="dxa"/>
-          </w:tcPr>
-          <w:p>
-            <w:r>
-              <w:rPr>
-                <w:sz w:val="16"/>
-              </w:rPr>
-              <w:t xml:space="preserve">sLORETA-guided HD-tDCS T2 specification: (1) T2 qEEG electrode dual-rated spec (Ag/AgCl 3.5mm, simultaneous EEG+stimulation); (2) sLORETA-to-10-20 mapping algorithm validated (FAI-HD01); (3) 4×1 montage current distribution verified (FAI-HD02–HD03); (4) simultaneous EEG+tDCS signal quality (FAI-HD04).</w:t>
-            </w:r>
-          </w:p>
-        </w:tc>
-        <w:tc>
-          <w:tcPr>
-            <w:tcW w:w="2015" w:type="dxa"/>
+              <w:t xml:space="preserve">RISK-03</w:t>
+            </w:r>
+          </w:p>
+        </w:tc>
+        <w:tc>
+          <w:tcPr>
+            <w:tcW w:w="1008" w:type="dxa"/>
             <w:shd w:val="clear" w:color="auto" w:fill="FFF2CC"/>
           </w:tcPr>
           <w:p>
             <w:r>
-              <w:rPr>
-                <w:sz w:val="16"/>
-              </w:rPr>
-              <w:t>SOFTWARE BASELINED — NP-FW-HD-001 Rev A baselined 2026-05-11. sLORETA-guided HD-tDCS firmware written (firmware/sloreta_hdtdcs/). Scalar sLORETA 2447-voxel weight matrix; 4×1 ring montage; 7 clinical targets; 30s ramp state machine; concurrent EEG with 200µs blanking. FAI-HD02 SOFTWARE PASS. Hardware FAI (FAI-HD01 phantom accuracy, FAI-HD03 focality, FAI-HD04 SNR bench) PENDING — requires T2 prototype. Closes Issue #23.</w:t>
+              <w:t xml:space="preserve">SOFTWARE BASELINED — NP-FW-HD-001 Rev A, 2026-05-11. Hardware FAI PENDING. Issue #23.</w:t>
             </w:r>
           </w:p>
         </w:tc>
@@ -5237,68 +5277,78 @@
       <w:tr>
         <w:tc>
           <w:tcPr>
+            <w:tcW w:w="792" w:type="dxa"/>
+            <w:shd w:val="clear" w:color="auto" w:fill="F5F5F5"/>
+          </w:tcPr>
+          <w:p>
+            <w:r>
+              <w:t xml:space="preserve">G3-08</w:t>
+            </w:r>
+          </w:p>
+        </w:tc>
+        <w:tc>
+          <w:tcPr>
+            <w:tcW w:w="1656" w:type="dxa"/>
+            <w:shd w:val="clear" w:color="auto" w:fill="F5F5F5"/>
+          </w:tcPr>
+          <w:p>
+            <w:r>
+              <w:t xml:space="preserve">EE + ME + Regulatory</w:t>
+            </w:r>
+          </w:p>
+        </w:tc>
+        <w:tc>
+          <w:tcPr>
+            <w:tcW w:w="3240" w:type="dxa"/>
+            <w:shd w:val="clear" w:color="auto" w:fill="F5F5F5"/>
+          </w:tcPr>
+          <w:p>
+            <w:r>
+              <w:t xml:space="preserve">Cervical VNS T2: (1) electrode placement (FAI-CV01); (2) cardiac interlock bench (FAI-CV02); (3) tolerability (FAI-CV03); (4) 510(k) pre-submission (electroCore K163334+K173323).</w:t>
+            </w:r>
+          </w:p>
+        </w:tc>
+        <w:tc>
+          <w:tcPr>
+            <w:tcW w:w="2664" w:type="dxa"/>
+            <w:shd w:val="clear" w:color="auto" w:fill="F5F5F5"/>
+          </w:tcPr>
+          <w:p>
+            <w:r>
+              <w:t xml:space="preserve">NP-FW-CVNS-001 Rev A + NP-REG-CVNS-001 Rev A. Firmware (firmware/cervical_vns/). FAI-CV02 SOFTWARE PASS. Hardware FAI + IRB pending.</w:t>
+            </w:r>
+          </w:p>
+        </w:tc>
+        <w:tc>
+          <w:tcPr>
+            <w:tcW w:w="864" w:type="dxa"/>
+            <w:shd w:val="clear" w:color="auto" w:fill="F5F5F5"/>
+          </w:tcPr>
+          <w:p>
+            <w:r>
+              <w:t xml:space="preserve">G3</w:t>
+            </w:r>
+          </w:p>
+        </w:tc>
+        <w:tc>
+          <w:tcPr>
             <w:tcW w:w="936" w:type="dxa"/>
-          </w:tcPr>
-          <w:p>
-            <w:r>
-              <w:rPr>
-                <w:b/>
-                <w:sz w:val="16"/>
-              </w:rPr>
-              <w:t xml:space="preserve">G3-08</w:t>
-            </w:r>
-          </w:p>
-        </w:tc>
-        <w:tc>
-          <w:tcPr>
-            <w:tcW w:w="792" w:type="dxa"/>
-          </w:tcPr>
-          <w:p>
-            <w:r>
-              <w:rPr>
-                <w:sz w:val="16"/>
-              </w:rPr>
-              <w:t xml:space="preserve">G3</w:t>
-            </w:r>
-          </w:p>
-        </w:tc>
-        <w:tc>
-          <w:tcPr>
-            <w:tcW w:w="1872" w:type="dxa"/>
-          </w:tcPr>
-          <w:p>
-            <w:r>
-              <w:rPr>
-                <w:sz w:val="16"/>
-              </w:rPr>
-              <w:t xml:space="preserve">EE + ME + Regulatory</w:t>
-            </w:r>
-          </w:p>
-        </w:tc>
-        <w:tc>
-          <w:tcPr>
-            <w:tcW w:w="4031" w:type="dxa"/>
-          </w:tcPr>
-          <w:p>
-            <w:r>
-              <w:rPr>
-                <w:sz w:val="16"/>
-              </w:rPr>
-              <w:t xml:space="preserve">Cervical VNS T2 accessory specification: (1) electrode placement guide in IFU (FAI-CV01); (2) cardiac safety interlock bench verified (FAI-CV02); (3) tolerability study complete (FAI-CV03); (4) 510(k) pre-submission strategy aligned with FDA (predicate: electroCore K163334 + K173323).</w:t>
-            </w:r>
-          </w:p>
-        </w:tc>
-        <w:tc>
-          <w:tcPr>
-            <w:tcW w:w="2015" w:type="dxa"/>
+            <w:shd w:val="clear" w:color="auto" w:fill="F5F5F5"/>
+          </w:tcPr>
+          <w:p>
+            <w:r>
+              <w:t xml:space="preserve">RISK-25</w:t>
+            </w:r>
+          </w:p>
+        </w:tc>
+        <w:tc>
+          <w:tcPr>
+            <w:tcW w:w="1008" w:type="dxa"/>
             <w:shd w:val="clear" w:color="auto" w:fill="FFF2CC"/>
           </w:tcPr>
           <w:p>
             <w:r>
-              <w:rPr>
-                <w:sz w:val="16"/>
-              </w:rPr>
-              <w:t>SOFTWARE BASELINED — NP-FW-CVNS-001 Rev A + NP-REG-CVNS-001 Rev A baselined 2026-05-11. Cervical VNS safety interlock firmware written (firmware/cervical_vns/). Dual-processor cardiac interlock: HR change &gt;15 BPM in 5s → GPIO cutoff &lt;5.1ms worst-case. FAI-CV02 SOFTWARE CONSTANTS PASS. 510(k) Q-Sub predicate aligned (electroCore K163334+K173323). Hardware FAI (FAI-CV01 phantom, FAI-CV02 timing bench, FAI-CV03 tolerability) PENDING — requires T2 prototype + IRB. Closes Issue #24.</w:t>
+              <w:t xml:space="preserve">SOFTWARE BASELINED — NP-FW-CVNS-001 Rev A + NP-REG-CVNS-001 Rev A, 2026-05-11. Issue #24.</w:t>
             </w:r>
           </w:p>
         </w:tc>
@@ -5329,6 +5379,244 @@
         <w:t>Current status of all coordination items. Updated as items close.</w:t>
       </w:r>
     </w:p>
+    <w:p>
+      <w:pPr>
+        <w:spacing w:before="240" w:after="120"/>
+      </w:pPr>
+      <w:r>
+        <w:rPr>
+          <w:b/>
+        </w:rPr>
+        <w:t>STATUS COLOR KEY</w:t>
+      </w:r>
+    </w:p>
+    <w:tbl>
+      <w:tblPr>
+        <w:tblStyle w:val="TableGrid"/>
+        <w:tblW w:w="0" w:type="auto"/>
+      </w:tblPr>
+      <w:tblGrid>
+        <w:gridCol w:w="1500"/>
+        <w:gridCol w:w="3500"/>
+        <w:gridCol w:w="5000"/>
+      </w:tblGrid>
+      <w:tr>
+        <w:tc>
+          <w:tcPr>
+            <w:tcW w:w="1500" w:type="dxa"/>
+            <w:shd w:val="clear" w:color="auto" w:fill="1F497D"/>
+          </w:tcPr>
+          <w:p>
+            <w:r>
+              <w:rPr>
+                <w:color w:val="FFFFFF"/>
+                <w:b/>
+              </w:rPr>
+              <w:t xml:space="preserve">Color</w:t>
+            </w:r>
+          </w:p>
+        </w:tc>
+        <w:tc>
+          <w:tcPr>
+            <w:tcW w:w="3500" w:type="dxa"/>
+            <w:shd w:val="clear" w:color="auto" w:fill="1F497D"/>
+          </w:tcPr>
+          <w:p>
+            <w:r>
+              <w:rPr>
+                <w:color w:val="FFFFFF"/>
+                <w:b/>
+              </w:rPr>
+              <w:t xml:space="preserve">Status</w:t>
+            </w:r>
+          </w:p>
+        </w:tc>
+        <w:tc>
+          <w:tcPr>
+            <w:tcW w:w="5000" w:type="dxa"/>
+            <w:shd w:val="clear" w:color="auto" w:fill="1F497D"/>
+          </w:tcPr>
+          <w:p>
+            <w:r>
+              <w:rPr>
+                <w:color w:val="FFFFFF"/>
+                <w:b/>
+              </w:rPr>
+              <w:t xml:space="preserve">Meaning</w:t>
+            </w:r>
+          </w:p>
+        </w:tc>
+      </w:tr>
+      <w:tr>
+        <w:tc>
+          <w:tcPr>
+            <w:tcW w:w="1500" w:type="dxa"/>
+            <w:shd w:val="clear" w:color="auto" w:fill="FF0000"/>
+          </w:tcPr>
+          <w:p>
+            <w:r>
+              <w:rPr>
+                <w:color w:val="FFFFFF"/>
+              </w:rPr>
+              <w:t xml:space="preserve"> </w:t>
+            </w:r>
+          </w:p>
+        </w:tc>
+        <w:tc>
+          <w:tcPr>
+            <w:tcW w:w="3500" w:type="dxa"/>
+            <w:shd w:val="clear" w:color="auto" w:fill="FF0000"/>
+          </w:tcPr>
+          <w:p>
+            <w:r>
+              <w:rPr>
+                <w:color w:val="FFFFFF"/>
+                <w:b/>
+              </w:rPr>
+              <w:t xml:space="preserve">BLOCKING</w:t>
+            </w:r>
+          </w:p>
+        </w:tc>
+        <w:tc>
+          <w:tcPr>
+            <w:tcW w:w="5000" w:type="dxa"/>
+          </w:tcPr>
+          <w:p>
+            <w:r>
+              <w:rPr/>
+              <w:t xml:space="preserve">Production-blocking item requiring immediate action</w:t>
+            </w:r>
+          </w:p>
+        </w:tc>
+      </w:tr>
+      <w:tr>
+        <w:tc>
+          <w:tcPr>
+            <w:tcW w:w="1500" w:type="dxa"/>
+            <w:shd w:val="clear" w:color="auto" w:fill="FFE699"/>
+          </w:tcPr>
+          <w:p>
+            <w:r>
+              <w:rPr>
+                <w:color w:val="604000"/>
+              </w:rPr>
+              <w:t xml:space="preserve"> </w:t>
+            </w:r>
+          </w:p>
+        </w:tc>
+        <w:tc>
+          <w:tcPr>
+            <w:tcW w:w="3500" w:type="dxa"/>
+            <w:shd w:val="clear" w:color="auto" w:fill="FFE699"/>
+          </w:tcPr>
+          <w:p>
+            <w:r>
+              <w:rPr>
+                <w:color w:val="604000"/>
+                <w:b/>
+              </w:rPr>
+              <w:t xml:space="preserve">OPEN</w:t>
+            </w:r>
+          </w:p>
+        </w:tc>
+        <w:tc>
+          <w:tcPr>
+            <w:tcW w:w="5000" w:type="dxa"/>
+          </w:tcPr>
+          <w:p>
+            <w:r>
+              <w:rPr/>
+              <w:t xml:space="preserve">Not yet started or in progress; action required</w:t>
+            </w:r>
+          </w:p>
+        </w:tc>
+      </w:tr>
+      <w:tr>
+        <w:tc>
+          <w:tcPr>
+            <w:tcW w:w="1500" w:type="dxa"/>
+            <w:shd w:val="clear" w:color="auto" w:fill="FFF2CC"/>
+          </w:tcPr>
+          <w:p>
+            <w:r>
+              <w:rPr>
+                <w:color w:val="604000"/>
+              </w:rPr>
+              <w:t xml:space="preserve"> </w:t>
+            </w:r>
+          </w:p>
+        </w:tc>
+        <w:tc>
+          <w:tcPr>
+            <w:tcW w:w="3500" w:type="dxa"/>
+            <w:shd w:val="clear" w:color="auto" w:fill="FFF2CC"/>
+          </w:tcPr>
+          <w:p>
+            <w:r>
+              <w:rPr>
+                <w:color w:val="604000"/>
+                <w:b/>
+              </w:rPr>
+              <w:t xml:space="preserve">PARTIAL / SOFTWARE BASELINED</w:t>
+            </w:r>
+          </w:p>
+        </w:tc>
+        <w:tc>
+          <w:tcPr>
+            <w:tcW w:w="5000" w:type="dxa"/>
+          </w:tcPr>
+          <w:p>
+            <w:r>
+              <w:rPr/>
+              <w:t xml:space="preserve">Work partially complete; hardware or external dependency remaining</w:t>
+            </w:r>
+          </w:p>
+        </w:tc>
+      </w:tr>
+      <w:tr>
+        <w:tc>
+          <w:tcPr>
+            <w:tcW w:w="1500" w:type="dxa"/>
+            <w:shd w:val="clear" w:color="auto" w:fill="E2EFDA"/>
+          </w:tcPr>
+          <w:p>
+            <w:r>
+              <w:rPr>
+                <w:color w:val="2E7D32"/>
+              </w:rPr>
+              <w:t xml:space="preserve"> </w:t>
+            </w:r>
+          </w:p>
+        </w:tc>
+        <w:tc>
+          <w:tcPr>
+            <w:tcW w:w="3500" w:type="dxa"/>
+            <w:shd w:val="clear" w:color="auto" w:fill="E2EFDA"/>
+          </w:tcPr>
+          <w:p>
+            <w:r>
+              <w:rPr>
+                <w:color w:val="2E7D32"/>
+                <w:b/>
+              </w:rPr>
+              <w:t xml:space="preserve">CLOSED</w:t>
+            </w:r>
+          </w:p>
+        </w:tc>
+        <w:tc>
+          <w:tcPr>
+            <w:tcW w:w="5000" w:type="dxa"/>
+          </w:tcPr>
+          <w:p>
+            <w:r>
+              <w:rPr/>
+              <w:t xml:space="preserve">Completed and verified; no further action required</w:t>
+            </w:r>
+          </w:p>
+        </w:tc>
+      </w:tr>
+    </w:tbl>
+    <w:p/>
     <w:tbl>
       <w:tblPr>
         <w:tblStyle w:val="TableGrid"/>
@@ -5860,7 +6148,7 @@
         <w:tc>
           <w:tcPr>
             <w:tcW w:type="dxa" w:w="1224"/>
-            <w:shd w:val="clear" w:color="auto" w:fill="FFE699"/>
+            <w:shd w:val="clear" w:color="auto" w:fill="E2EFDA"/>
             <w:shd w:val="clear" w:color="auto" w:fill="E2EFDA"/>
           </w:tcPr>
           <w:p>
@@ -6718,17 +7006,9 @@
             <w:shd w:val="clear" w:color="auto" w:fill="F8F8F8"/>
           </w:tcPr>
           <w:p>
-            <w:r>
-              <w:rPr>
-                <w:sz w:val="16"/>
-              </w:rPr>
-            </w:r>
-            <w:r>
-              <w:rPr>
-                <w:b w:val="0"/>
-                <w:sz w:val="16"/>
-              </w:rPr>
-              <w:t>RISK-15 — Unique asymmetric mechanical key geometry for each of 5 zone slots (Layer 1 of 5-layer accessibility system). Key must physically prevent wrong-zone insertion for ALL users including blind. Also in this item: (a) tactile dot patterns adjacent to each slot in shell (N dots = zone N, Layer 4, ISO 9241-920); (b) braille + raised numeral on zone module face (Layer 3, ISO 17049:2013). All three features must be in shell/module tooling spec before first-cut. Zero BOM cost if specified now. See NP-HW-FPC-001 §11.4.</w:t>
+            <w:r/>
+            <w:r>
+              <w:t>Mech Eng</w:t>
             </w:r>
           </w:p>
         </w:tc>
@@ -6738,17 +7018,9 @@
             <w:shd w:val="clear" w:color="auto" w:fill="F8F8F8"/>
           </w:tcPr>
           <w:p>
-            <w:r>
-              <w:rPr>
-                <w:sz w:val="16"/>
-              </w:rPr>
-            </w:r>
-            <w:r>
-              <w:rPr>
-                <w:b w:val="0"/>
-                <w:sz w:val="16"/>
-              </w:rPr>
-              <w:t>Key geometry drawings all 5 zones. Shell drawing showing tactile dot positions (N dots per zone). Zone module drawing showing braille cell and raised numeral. Written confirmation no two key profiles are interchangeable.</w:t>
+            <w:r/>
+            <w:r>
+              <w:t>Zone slot keying geometry — mechanical + tactile + braille (RISK-15)</w:t>
             </w:r>
           </w:p>
         </w:tc>
@@ -8135,8 +8407,9 @@
             <w:tcW w:w="1872" w:type="dxa"/>
           </w:tcPr>
           <w:p>
-            <w:r>
-              <w:t>ME + Optical Eng + EE</w:t>
+            <w:r/>
+            <w:r>
+              <w:t>ME + Optical + EE</w:t>
             </w:r>
           </w:p>
         </w:tc>
@@ -8145,8 +8418,9 @@
             <w:tcW w:w="4031" w:type="dxa"/>
           </w:tcPr>
           <w:p>
-            <w:r>
-              <w:t>Lens and goggle assembly G2 gate items: (1) NP-TOOL-LENS-001 Rev B mould design review checklist (MR-01 through MR-20) completed before goggle arm tooling is cut; specifically MR-19 (F-07 shade clearance ≥ 4 mm, Issue #18) and MR-20 (tether routing ≤ 45 mm, no FOV crossing, Issue #18); (2) OI-10 CAD confirmation of F-07 position signed off; (3) NP-FAI-LENS-001 FAI checklist created (OI-8). Ref: NP-TOOL-LENS-001 Rev B §6 and §8.</w:t>
+            <w:r/>
+            <w:r>
+              <w:t>Lens + goggle assembly G2 gate (NP-TOOL-LENS-001 Rev B)</w:t>
             </w:r>
           </w:p>
         </w:tc>
@@ -8188,8 +8462,9 @@
             <w:tcW w:w="1872" w:type="dxa"/>
           </w:tcPr>
           <w:p>
-            <w:r>
-              <w:t xml:space="preserve">Firmware Lead + Systems Eng</w:t>
+            <w:r/>
+            <w:r>
+              <w:t>Firmware Lead + Systems Eng</w:t>
             </w:r>
           </w:p>
         </w:tc>
@@ -8198,8 +8473,9 @@
             <w:tcW w:w="4031" w:type="dxa"/>
           </w:tcPr>
           <w:p>
-            <w:r>
-              <w:t xml:space="preserve">Hub control program (NP-FW-HUB-001 Rev A) — main application firmware for i.MX RT1062. Four FreeRTOS tasks: module probe, protocol runner, telemetry, safety SPI heartbeat. Deliverable: firmware written, T1 modules connected to HAL stubs, T2 stubs present, protocol dispatch tested, 200ms heartbeat verified.</w:t>
+            <w:r/>
+            <w:r>
+              <w:t>Hub control program (NP-FW-HUB-001 Rev A) — 4 FreeRTOS tasks</w:t>
             </w:r>
           </w:p>
         </w:tc>
@@ -8222,7 +8498,7 @@
         <w:spacing w:after="160"/>
       </w:pPr>
       <w:r>
-        <w:t>Status at 2026-05-16: 2 BLOCKING items (G1-01 regulatory opinion, G1-07 LED part numbers). G1-13 CLOSED (NP-FW-REQ-001 Rev A — DEPRECATED, superseded by individual firmware specs). G1-15 CLOSED (FPC layout freeze, PD2 at X=33.0mm Y=39.0mm). G1-16 CLOSED (NP-FW-EMMC-001 Rev A). G2-10 CLOSED (NP-FW-ZA-001 Rev A). G2-11 CLOSED (NP-DRV-SHELL-001 Rev B). G2-12 CLOSED (NP-FW-HRV-001 Rev A). G2-13 OPEN (lens assembly). G2-14 PARTIAL (hub control program written, HAL stubs pending). G3-07 SOFTWARE BASELINED (NP-FW-HD-001 Rev A, hardware FAI pending T2 prototype). G3-08 SOFTWARE BASELINED (NP-FW-CVNS-001 Rev A, hardware FAI pending T2 prototype).</w:t>
+        <w:t>Status at 2026-06-28: 2 BLOCKING items (G1-01 regulatory opinion, G1-07 LED part numbers). G1-13 CLOSED (NP-FW-REQ-001 Rev A — DEPRECATED, superseded by individual firmware specs). G1-15 CLOSED (FPC layout freeze, PD2 at X=33.0mm Y=39.0mm). G1-16 CLOSED (NP-FW-EMMC-001 Rev A). G2-10 CLOSED (NP-FW-ZA-001 Rev A). G2-11 CLOSED (NP-DRV-SHELL-001 Rev B). G2-12 CLOSED (NP-FW-HRV-001 Rev A). G2-13 OPEN (lens assembly). G2-14 PARTIAL (hub control program written, HAL stubs pending). G3-07 SOFTWARE BASELINED (NP-FW-HD-001 Rev A, hardware FAI pending T2 prototype). G3-08 SOFTWARE BASELINED (NP-FW-CVNS-001 Rev A, hardware FAI pending T2 prototype).</w:t>
       </w:r>
     </w:p>
     <w:p>
@@ -8717,6 +8993,52 @@
           <w:p>
             <w:r>
               <w:t xml:space="preserve">G2-14 added — Hub control program (NP-FW-HUB-001 Rev A) as G2 deliverable. PARTIAL closure — core firmware written; HAL stubs pending prototype hardware.</w:t>
+            </w:r>
+          </w:p>
+        </w:tc>
+      </w:tr>
+      <w:tr>
+        <w:tc>
+          <w:tcPr>
+            <w:tcW w:type="dxa" w:w="2520"/>
+            <w:shd w:val="clear" w:color="auto" w:fill="F5F5F5"/>
+          </w:tcPr>
+          <w:p>
+            <w:r>
+              <w:t>A.9</w:t>
+            </w:r>
+          </w:p>
+        </w:tc>
+        <w:tc>
+          <w:tcPr>
+            <w:tcW w:type="dxa" w:w="2520"/>
+            <w:shd w:val="clear" w:color="auto" w:fill="F5F5F5"/>
+          </w:tcPr>
+          <w:p>
+            <w:r>
+              <w:t>2026-06-28</w:t>
+            </w:r>
+          </w:p>
+        </w:tc>
+        <w:tc>
+          <w:tcPr>
+            <w:tcW w:type="dxa" w:w="2520"/>
+            <w:shd w:val="clear" w:color="auto" w:fill="F5F5F5"/>
+          </w:tcPr>
+          <w:p>
+            <w:r>
+              <w:t>NeuroPulse Engineering</w:t>
+            </w:r>
+          </w:p>
+        </w:tc>
+        <w:tc>
+          <w:tcPr>
+            <w:tcW w:type="dxa" w:w="2520"/>
+            <w:shd w:val="clear" w:color="auto" w:fill="F5F5F5"/>
+          </w:tcPr>
+          <w:p>
+            <w:r>
+              <w:t>Table format consistency: fixed 8 detail-table rows with incorrect 5-column format (G1-13, G1-14, G2-10, G2-11, G2-12, G2-14, G3-07, G3-08) — all now 7-column matching headers. Fixed G1-06 detail row (status text in Gate column). Abbreviated summary dashboard rows G2-02, G2-13, G2-14. Added status color coding key. G1-06 summary shading corrected to CLOSED.</w:t>
             </w:r>
           </w:p>
         </w:tc>

</xml_diff>